<commit_message>
Fix CV photo centering/sizing and center hero photo above name
CV: center the header photo (was right-aligned inside a wider cell,
causing uneven white space) and bump font sizes/spacing throughout
so content fills page 2 instead of leaving it mostly blank.

Site: stack the hero photo above the name/intro on all screen
sizes, centered, instead of only on mobile.

Co-Authored-By: Claude Sonnet 5 <noreply@anthropic.com>
</commit_message>
<xml_diff>
--- a/scripts/cv_source.docx
+++ b/scripts/cv_source.docx
@@ -17,13 +17,13 @@
         </w:tblBorders>
       </w:tblPr>
       <w:tblGrid>
-        <w:gridCol w:w="8334"/>
-        <w:gridCol w:w="1474"/>
+        <w:gridCol w:w="8220"/>
+        <w:gridCol w:w="1587"/>
       </w:tblGrid>
       <w:tr>
         <w:tc>
           <w:tcPr>
-            <w:tcW w:type="dxa" w:w="8334"/>
+            <w:tcW w:type="dxa" w:w="8220"/>
           </w:tcPr>
           <w:p>
             <w:pPr>
@@ -79,17 +79,25 @@
         </w:tc>
         <w:tc>
           <w:tcPr>
-            <w:tcW w:type="dxa" w:w="1474"/>
+            <w:tcW w:type="dxa" w:w="1587"/>
             <w:vAlign w:val="center"/>
+            <w:tcMar>
+              <w:top w:w="0" w:type="dxa"/>
+              <w:start w:w="0" w:type="dxa"/>
+              <w:bottom w:w="0" w:type="dxa"/>
+              <w:end w:w="0" w:type="dxa"/>
+              <w:left w:w="0" w:type="dxa"/>
+              <w:right w:w="0" w:type="dxa"/>
+            </w:tcMar>
           </w:tcPr>
           <w:p>
             <w:pPr>
-              <w:jc w:val="right"/>
+              <w:jc w:val="center"/>
             </w:pPr>
             <w:r>
               <w:drawing>
                 <wp:inline xmlns:a="http://schemas.openxmlformats.org/drawingml/2006/main" xmlns:pic="http://schemas.openxmlformats.org/drawingml/2006/picture">
-                  <wp:extent cx="936000" cy="1206000"/>
+                  <wp:extent cx="900000" cy="1159200"/>
                   <wp:docPr id="1" name="Picture 1"/>
                   <wp:cNvGraphicFramePr>
                     <a:graphicFrameLocks noChangeAspect="1"/>
@@ -110,7 +118,7 @@
                         <pic:spPr>
                           <a:xfrm>
                             <a:off x="0" y="0"/>
-                            <a:ext cx="936000" cy="1206000"/>
+                            <a:ext cx="900000" cy="1159200"/>
                           </a:xfrm>
                           <a:prstGeom prst="rect"/>
                         </pic:spPr>
@@ -131,7 +139,7 @@
     </w:p>
     <w:p>
       <w:pPr>
-        <w:spacing w:before="240" w:after="80"/>
+        <w:spacing w:before="320" w:after="100"/>
         <w:pBdr>
           <w:bottom w:val="single" w:sz="4" w:space="1" w:color="0F9D6A"/>
         </w:pBdr>
@@ -141,14 +149,14 @@
           <w:rFonts w:ascii="Calibri" w:hAnsi="Calibri"/>
           <w:b/>
           <w:color w:val="0F9D6A"/>
-          <w:sz w:val="24"/>
+          <w:sz w:val="26"/>
         </w:rPr>
         <w:t>PROFILE</w:t>
       </w:r>
     </w:p>
     <w:p>
       <w:pPr>
-        <w:spacing w:before="0" w:after="60" w:line="252" w:lineRule="auto"/>
+        <w:spacing w:before="0" w:after="80" w:line="252" w:lineRule="auto"/>
       </w:pPr>
       <w:r>
         <w:rPr>
@@ -156,14 +164,14 @@
           <w:b w:val="0"/>
           <w:i w:val="0"/>
           <w:color w:val="111111"/>
-          <w:sz w:val="19"/>
+          <w:sz w:val="20"/>
         </w:rPr>
         <w:t>SDET with 5+ years designing, building, and maintaining automated E2E and API test suites in TypeScript and Python across fintech, media, and automotive platforms. Owns quality gates end to end: shift-left test strategy, Playwright/Pytest automation, Docker-containerized environments, and staged CI/CD pipelines in GitHub Actions, GitLab CI, and Jenkins. Hands-on with AWS and observability (Grafana, CloudWatch), and building practical AI-assisted testing skills through public LLM-driven test-generation projects.</w:t>
       </w:r>
     </w:p>
     <w:p>
       <w:pPr>
-        <w:spacing w:before="240" w:after="80"/>
+        <w:spacing w:before="320" w:after="100"/>
         <w:pBdr>
           <w:bottom w:val="single" w:sz="4" w:space="1" w:color="0F9D6A"/>
         </w:pBdr>
@@ -173,174 +181,174 @@
           <w:rFonts w:ascii="Calibri" w:hAnsi="Calibri"/>
           <w:b/>
           <w:color w:val="0F9D6A"/>
-          <w:sz w:val="24"/>
+          <w:sz w:val="26"/>
         </w:rPr>
         <w:t>TECHNICAL SKILLS</w:t>
       </w:r>
     </w:p>
     <w:p>
       <w:pPr>
-        <w:spacing w:after="48" w:line="247" w:lineRule="auto"/>
+        <w:spacing w:after="68" w:line="264" w:lineRule="auto"/>
       </w:pPr>
       <w:r>
         <w:rPr>
           <w:b/>
           <w:color w:val="111111"/>
-          <w:sz w:val="18"/>
+          <w:sz w:val="19"/>
         </w:rPr>
         <w:t xml:space="preserve">Test Management: </w:t>
       </w:r>
       <w:r>
         <w:rPr>
           <w:color w:val="444444"/>
-          <w:sz w:val="18"/>
+          <w:sz w:val="19"/>
         </w:rPr>
         <w:t>TestRails, BrowserStack Test Management, Lambda Test, MS Excel, Test Planning, TDD, BDD, Shift-left testing, Regression Testing, Smoke Testing, Exploratory testing, Defect management.</w:t>
       </w:r>
     </w:p>
     <w:p>
       <w:pPr>
-        <w:spacing w:after="48" w:line="247" w:lineRule="auto"/>
+        <w:spacing w:after="68" w:line="264" w:lineRule="auto"/>
       </w:pPr>
       <w:r>
         <w:rPr>
           <w:b/>
           <w:color w:val="111111"/>
-          <w:sz w:val="18"/>
+          <w:sz w:val="19"/>
         </w:rPr>
         <w:t xml:space="preserve">Test Automation: </w:t>
       </w:r>
       <w:r>
         <w:rPr>
           <w:color w:val="444444"/>
-          <w:sz w:val="18"/>
+          <w:sz w:val="19"/>
         </w:rPr>
         <w:t>Playwright (TypeScript/JavaScript), Cypress, Appium, Pytest, Selenium, Postman/Newman, REST API testing</w:t>
       </w:r>
     </w:p>
     <w:p>
       <w:pPr>
-        <w:spacing w:after="48" w:line="247" w:lineRule="auto"/>
+        <w:spacing w:after="68" w:line="264" w:lineRule="auto"/>
       </w:pPr>
       <w:r>
         <w:rPr>
           <w:b/>
           <w:color w:val="111111"/>
-          <w:sz w:val="18"/>
+          <w:sz w:val="19"/>
         </w:rPr>
         <w:t xml:space="preserve">Project Management: </w:t>
       </w:r>
       <w:r>
         <w:rPr>
           <w:color w:val="444444"/>
-          <w:sz w:val="18"/>
+          <w:sz w:val="19"/>
         </w:rPr>
         <w:t>JIRA, Confluence, Agile (Scrum/Kanban), X-RAY, GitLab</w:t>
       </w:r>
     </w:p>
     <w:p>
       <w:pPr>
-        <w:spacing w:after="48" w:line="247" w:lineRule="auto"/>
+        <w:spacing w:after="68" w:line="264" w:lineRule="auto"/>
       </w:pPr>
       <w:r>
         <w:rPr>
           <w:b/>
           <w:color w:val="111111"/>
-          <w:sz w:val="18"/>
+          <w:sz w:val="19"/>
         </w:rPr>
         <w:t xml:space="preserve">Languages &amp; Scripting: </w:t>
       </w:r>
       <w:r>
         <w:rPr>
           <w:color w:val="444444"/>
-          <w:sz w:val="18"/>
+          <w:sz w:val="19"/>
         </w:rPr>
         <w:t>TypeScript, JavaScript, Python, JAVA, Bash/Shell, SQL</w:t>
       </w:r>
     </w:p>
     <w:p>
       <w:pPr>
-        <w:spacing w:after="48" w:line="247" w:lineRule="auto"/>
+        <w:spacing w:after="68" w:line="264" w:lineRule="auto"/>
       </w:pPr>
       <w:r>
         <w:rPr>
           <w:b/>
           <w:color w:val="111111"/>
-          <w:sz w:val="18"/>
+          <w:sz w:val="19"/>
         </w:rPr>
         <w:t xml:space="preserve">AI-Assisted Testing: </w:t>
       </w:r>
       <w:r>
         <w:rPr>
           <w:color w:val="444444"/>
-          <w:sz w:val="18"/>
+          <w:sz w:val="19"/>
         </w:rPr>
         <w:t>Prompt engineering, AI-generated test cases, Playwright MCP, Playwright CLI, Claude Code, Cursor, GitHub Co-Pilot</w:t>
       </w:r>
     </w:p>
     <w:p>
       <w:pPr>
-        <w:spacing w:after="48" w:line="247" w:lineRule="auto"/>
+        <w:spacing w:after="68" w:line="264" w:lineRule="auto"/>
       </w:pPr>
       <w:r>
         <w:rPr>
           <w:b/>
           <w:color w:val="111111"/>
-          <w:sz w:val="18"/>
+          <w:sz w:val="19"/>
         </w:rPr>
         <w:t xml:space="preserve">CI/CD &amp; DevOps: </w:t>
       </w:r>
       <w:r>
         <w:rPr>
           <w:color w:val="444444"/>
-          <w:sz w:val="18"/>
+          <w:sz w:val="19"/>
         </w:rPr>
         <w:t>GitHub Actions, CI/CD, Jenkins, Azure DevOps, Docker.</w:t>
       </w:r>
     </w:p>
     <w:p>
       <w:pPr>
-        <w:spacing w:after="48" w:line="247" w:lineRule="auto"/>
+        <w:spacing w:after="68" w:line="264" w:lineRule="auto"/>
       </w:pPr>
       <w:r>
         <w:rPr>
           <w:b/>
           <w:color w:val="111111"/>
-          <w:sz w:val="18"/>
+          <w:sz w:val="19"/>
         </w:rPr>
         <w:t xml:space="preserve">Cloud &amp; IaC: </w:t>
       </w:r>
       <w:r>
         <w:rPr>
           <w:color w:val="444444"/>
-          <w:sz w:val="18"/>
+          <w:sz w:val="19"/>
         </w:rPr>
         <w:t>AWS (EC2, S3, IAM, CloudWatch), Terraform and Kubernetes (foundational)</w:t>
       </w:r>
     </w:p>
     <w:p>
       <w:pPr>
-        <w:spacing w:after="48" w:line="247" w:lineRule="auto"/>
+        <w:spacing w:after="68" w:line="264" w:lineRule="auto"/>
       </w:pPr>
       <w:r>
         <w:rPr>
           <w:b/>
           <w:color w:val="111111"/>
-          <w:sz w:val="18"/>
+          <w:sz w:val="19"/>
         </w:rPr>
         <w:t xml:space="preserve">Monitoring &amp; Observability: </w:t>
       </w:r>
       <w:r>
         <w:rPr>
           <w:color w:val="444444"/>
-          <w:sz w:val="18"/>
+          <w:sz w:val="19"/>
         </w:rPr>
         <w:t>Grafana, AWS CloudWatch, Flaky-test analysis, DeepEval, Langfuse, LLM tracing, evaluation datasets, quality metrics, latency/token monitoring, AI failure analysis</w:t>
       </w:r>
     </w:p>
     <w:p>
       <w:pPr>
-        <w:spacing w:before="240" w:after="80"/>
+        <w:spacing w:before="320" w:after="100"/>
         <w:pBdr>
           <w:bottom w:val="single" w:sz="4" w:space="1" w:color="0F9D6A"/>
         </w:pBdr>
@@ -350,7 +358,7 @@
           <w:rFonts w:ascii="Calibri" w:hAnsi="Calibri"/>
           <w:b/>
           <w:color w:val="0F9D6A"/>
-          <w:sz w:val="24"/>
+          <w:sz w:val="26"/>
         </w:rPr>
         <w:t>WORK EXPERIENCE</w:t>
       </w:r>
@@ -360,13 +368,13 @@
         <w:tabs>
           <w:tab w:pos="10652" w:val="decimal"/>
         </w:tabs>
-        <w:spacing w:before="180" w:after="0"/>
+        <w:spacing w:before="260" w:after="0"/>
       </w:pPr>
       <w:r>
         <w:rPr>
           <w:b/>
           <w:color w:val="111111"/>
-          <w:sz w:val="19"/>
+          <w:sz w:val="21"/>
         </w:rPr>
         <w:t>QA Engineer (SDET)  ·  DYN Media GmbH, Cologne</w:t>
       </w:r>
@@ -377,91 +385,91 @@
         <w:rPr>
           <w:i/>
           <w:color w:val="444444"/>
-          <w:sz w:val="17"/>
+          <w:sz w:val="18"/>
         </w:rPr>
         <w:t>Jul 2024 – Present</w:t>
       </w:r>
     </w:p>
     <w:p>
       <w:pPr>
-        <w:spacing w:before="0" w:after="44" w:line="247" w:lineRule="auto"/>
+        <w:spacing w:before="0" w:after="64" w:line="269" w:lineRule="auto"/>
         <w:ind w:left="255" w:hanging="159"/>
       </w:pPr>
       <w:r>
         <w:rPr>
           <w:b/>
           <w:color w:val="0F9D6A"/>
-          <w:sz w:val="18"/>
+          <w:sz w:val="19"/>
         </w:rPr>
         <w:t xml:space="preserve">• </w:t>
       </w:r>
       <w:r>
         <w:rPr>
           <w:color w:val="111111"/>
-          <w:sz w:val="18"/>
+          <w:sz w:val="19"/>
         </w:rPr>
         <w:t>Design, build, and maintain automated E2E (Playwright/TypeScript) and API test suites, enforced quality gates in CI/CD pipelines (GitHub Actions) on every pull request and merge.</w:t>
       </w:r>
     </w:p>
     <w:p>
       <w:pPr>
-        <w:spacing w:before="0" w:after="44" w:line="247" w:lineRule="auto"/>
+        <w:spacing w:before="0" w:after="64" w:line="269" w:lineRule="auto"/>
         <w:ind w:left="255" w:hanging="159"/>
       </w:pPr>
       <w:r>
         <w:rPr>
           <w:b/>
           <w:color w:val="0F9D6A"/>
-          <w:sz w:val="18"/>
+          <w:sz w:val="19"/>
         </w:rPr>
         <w:t xml:space="preserve">• </w:t>
       </w:r>
       <w:r>
         <w:rPr>
           <w:color w:val="111111"/>
-          <w:sz w:val="18"/>
+          <w:sz w:val="19"/>
         </w:rPr>
         <w:t>Integrated Playwright CLI with AI coding tools (Claude, Cursor) to automate test generation and DOM inspection, cutting script creation time by 35%.</w:t>
       </w:r>
     </w:p>
     <w:p>
       <w:pPr>
-        <w:spacing w:before="0" w:after="44" w:line="247" w:lineRule="auto"/>
+        <w:spacing w:before="0" w:after="64" w:line="269" w:lineRule="auto"/>
         <w:ind w:left="255" w:hanging="159"/>
       </w:pPr>
       <w:r>
         <w:rPr>
           <w:b/>
           <w:color w:val="0F9D6A"/>
-          <w:sz w:val="18"/>
+          <w:sz w:val="19"/>
         </w:rPr>
         <w:t xml:space="preserve">• </w:t>
       </w:r>
       <w:r>
         <w:rPr>
           <w:color w:val="111111"/>
-          <w:sz w:val="18"/>
+          <w:sz w:val="19"/>
         </w:rPr>
         <w:t>Implemented Playwright MCP server in sandboxed test environments to enable dynamic, prompt-driven UI validation and automated exploratory testing.</w:t>
       </w:r>
     </w:p>
     <w:p>
       <w:pPr>
-        <w:spacing w:before="0" w:after="44" w:line="247" w:lineRule="auto"/>
+        <w:spacing w:before="0" w:after="64" w:line="269" w:lineRule="auto"/>
         <w:ind w:left="255" w:hanging="159"/>
       </w:pPr>
       <w:r>
         <w:rPr>
           <w:b/>
           <w:color w:val="0F9D6A"/>
-          <w:sz w:val="18"/>
+          <w:sz w:val="19"/>
         </w:rPr>
         <w:t xml:space="preserve">• </w:t>
       </w:r>
       <w:r>
         <w:rPr>
           <w:color w:val="111111"/>
-          <w:sz w:val="18"/>
+          <w:sz w:val="19"/>
         </w:rPr>
         <w:t>Visualized, captured, and diagnosed UI glitches by taking automated screenshots, recording session logs, and checking network traffic during test runs.</w:t>
       </w:r>
@@ -471,13 +479,13 @@
         <w:tabs>
           <w:tab w:pos="10652" w:val="decimal"/>
         </w:tabs>
-        <w:spacing w:before="180" w:after="0"/>
+        <w:spacing w:before="260" w:after="0"/>
       </w:pPr>
       <w:r>
         <w:rPr>
           <w:b/>
           <w:color w:val="111111"/>
-          <w:sz w:val="19"/>
+          <w:sz w:val="21"/>
         </w:rPr>
         <w:t>System Test Engineer  ·  Joynext GmbH, Dresden</w:t>
       </w:r>
@@ -488,91 +496,91 @@
         <w:rPr>
           <w:i/>
           <w:color w:val="444444"/>
-          <w:sz w:val="17"/>
+          <w:sz w:val="18"/>
         </w:rPr>
         <w:t>Sep 2023 – Feb 2024</w:t>
       </w:r>
     </w:p>
     <w:p>
       <w:pPr>
-        <w:spacing w:before="0" w:after="44" w:line="247" w:lineRule="auto"/>
+        <w:spacing w:before="0" w:after="64" w:line="269" w:lineRule="auto"/>
         <w:ind w:left="255" w:hanging="159"/>
       </w:pPr>
       <w:r>
         <w:rPr>
           <w:b/>
           <w:color w:val="0F9D6A"/>
-          <w:sz w:val="18"/>
+          <w:sz w:val="19"/>
         </w:rPr>
         <w:t xml:space="preserve">• </w:t>
       </w:r>
       <w:r>
         <w:rPr>
           <w:color w:val="111111"/>
-          <w:sz w:val="18"/>
+          <w:sz w:val="19"/>
         </w:rPr>
         <w:t>Executed system and integration tests for automotive infotainment firmware on hardware benches and simulators against OEM specifications, catching critical defects before OEM sign-off.</w:t>
       </w:r>
     </w:p>
     <w:p>
       <w:pPr>
-        <w:spacing w:before="0" w:after="44" w:line="247" w:lineRule="auto"/>
+        <w:spacing w:before="0" w:after="64" w:line="269" w:lineRule="auto"/>
         <w:ind w:left="255" w:hanging="159"/>
       </w:pPr>
       <w:r>
         <w:rPr>
           <w:b/>
           <w:color w:val="0F9D6A"/>
-          <w:sz w:val="18"/>
+          <w:sz w:val="19"/>
         </w:rPr>
         <w:t xml:space="preserve">• </w:t>
       </w:r>
       <w:r>
         <w:rPr>
           <w:color w:val="111111"/>
-          <w:sz w:val="18"/>
+          <w:sz w:val="19"/>
         </w:rPr>
         <w:t>Maintained full requirements traceability matrices so every infotainment module had documented coverage.</w:t>
       </w:r>
     </w:p>
     <w:p>
       <w:pPr>
-        <w:spacing w:before="0" w:after="44" w:line="247" w:lineRule="auto"/>
+        <w:spacing w:before="0" w:after="64" w:line="269" w:lineRule="auto"/>
         <w:ind w:left="255" w:hanging="159"/>
       </w:pPr>
       <w:r>
         <w:rPr>
           <w:b/>
           <w:color w:val="0F9D6A"/>
-          <w:sz w:val="18"/>
+          <w:sz w:val="19"/>
         </w:rPr>
         <w:t xml:space="preserve">• </w:t>
       </w:r>
       <w:r>
         <w:rPr>
           <w:color w:val="111111"/>
-          <w:sz w:val="18"/>
+          <w:sz w:val="19"/>
         </w:rPr>
         <w:t>Coordinated defect correction with OEM stakeholders and development teams within an agile release cycle.</w:t>
       </w:r>
     </w:p>
     <w:p>
       <w:pPr>
-        <w:spacing w:before="0" w:after="44" w:line="247" w:lineRule="auto"/>
+        <w:spacing w:before="0" w:after="64" w:line="269" w:lineRule="auto"/>
         <w:ind w:left="255" w:hanging="159"/>
       </w:pPr>
       <w:r>
         <w:rPr>
           <w:b/>
           <w:color w:val="0F9D6A"/>
-          <w:sz w:val="18"/>
+          <w:sz w:val="19"/>
         </w:rPr>
         <w:t xml:space="preserve">• </w:t>
       </w:r>
       <w:r>
         <w:rPr>
           <w:color w:val="111111"/>
-          <w:sz w:val="18"/>
+          <w:sz w:val="19"/>
         </w:rPr>
         <w:t>Performed exploratory testing of new features and complex edge cases; documented defects with reproduction steps and coordinated fixes with developers and product owners.</w:t>
       </w:r>
@@ -582,13 +590,13 @@
         <w:tabs>
           <w:tab w:pos="10652" w:val="decimal"/>
         </w:tabs>
-        <w:spacing w:before="180" w:after="0"/>
+        <w:spacing w:before="260" w:after="0"/>
       </w:pPr>
       <w:r>
         <w:rPr>
           <w:b/>
           <w:color w:val="111111"/>
-          <w:sz w:val="19"/>
+          <w:sz w:val="21"/>
         </w:rPr>
         <w:t>Test Automation Engineer  ·  Finoa GmbH, Berlin</w:t>
       </w:r>
@@ -599,70 +607,70 @@
         <w:rPr>
           <w:i/>
           <w:color w:val="444444"/>
-          <w:sz w:val="17"/>
+          <w:sz w:val="18"/>
         </w:rPr>
         <w:t>Nov 2022 – Aug 2023</w:t>
       </w:r>
     </w:p>
     <w:p>
       <w:pPr>
-        <w:spacing w:before="0" w:after="44" w:line="247" w:lineRule="auto"/>
+        <w:spacing w:before="0" w:after="64" w:line="269" w:lineRule="auto"/>
         <w:ind w:left="255" w:hanging="159"/>
       </w:pPr>
       <w:r>
         <w:rPr>
           <w:b/>
           <w:color w:val="0F9D6A"/>
-          <w:sz w:val="18"/>
+          <w:sz w:val="19"/>
         </w:rPr>
         <w:t xml:space="preserve">• </w:t>
       </w:r>
       <w:r>
         <w:rPr>
           <w:color w:val="111111"/>
-          <w:sz w:val="18"/>
+          <w:sz w:val="19"/>
         </w:rPr>
         <w:t>Built and maintained CI/CD-integrated end-to-end and REST API test automation with parallel execution for a regulated crypto-asset platform, raising QA throughput and cutting flaky failures.</w:t>
       </w:r>
     </w:p>
     <w:p>
       <w:pPr>
-        <w:spacing w:before="0" w:after="44" w:line="247" w:lineRule="auto"/>
+        <w:spacing w:before="0" w:after="64" w:line="269" w:lineRule="auto"/>
         <w:ind w:left="255" w:hanging="159"/>
       </w:pPr>
       <w:r>
         <w:rPr>
           <w:b/>
           <w:color w:val="0F9D6A"/>
-          <w:sz w:val="18"/>
+          <w:sz w:val="19"/>
         </w:rPr>
         <w:t xml:space="preserve">• </w:t>
       </w:r>
       <w:r>
         <w:rPr>
           <w:color w:val="111111"/>
-          <w:sz w:val="18"/>
+          <w:sz w:val="19"/>
         </w:rPr>
         <w:t>Integrated automated API tests into CI pipelines to detect integration and regression problems early in the development lifecycle.</w:t>
       </w:r>
     </w:p>
     <w:p>
       <w:pPr>
-        <w:spacing w:before="0" w:after="44" w:line="247" w:lineRule="auto"/>
+        <w:spacing w:before="0" w:after="64" w:line="269" w:lineRule="auto"/>
         <w:ind w:left="255" w:hanging="159"/>
       </w:pPr>
       <w:r>
         <w:rPr>
           <w:b/>
           <w:color w:val="0F9D6A"/>
-          <w:sz w:val="18"/>
+          <w:sz w:val="19"/>
         </w:rPr>
         <w:t xml:space="preserve">• </w:t>
       </w:r>
       <w:r>
         <w:rPr>
           <w:color w:val="111111"/>
-          <w:sz w:val="18"/>
+          <w:sz w:val="19"/>
         </w:rPr>
         <w:t>Kept the automation codebase maintainable through modular design and code review across TypeScript and Python.</w:t>
       </w:r>
@@ -672,13 +680,13 @@
         <w:tabs>
           <w:tab w:pos="10652" w:val="decimal"/>
         </w:tabs>
-        <w:spacing w:before="180" w:after="0"/>
+        <w:spacing w:before="260" w:after="0"/>
       </w:pPr>
       <w:r>
         <w:rPr>
           <w:b/>
           <w:color w:val="111111"/>
-          <w:sz w:val="19"/>
+          <w:sz w:val="21"/>
         </w:rPr>
         <w:t>Software Tester  ·  Scoolio GmbH, Dresden</w:t>
       </w:r>
@@ -689,70 +697,70 @@
         <w:rPr>
           <w:i/>
           <w:color w:val="444444"/>
-          <w:sz w:val="17"/>
+          <w:sz w:val="18"/>
         </w:rPr>
         <w:t>Jan 2020 – Sep 2022</w:t>
       </w:r>
     </w:p>
     <w:p>
       <w:pPr>
-        <w:spacing w:before="0" w:after="44" w:line="247" w:lineRule="auto"/>
+        <w:spacing w:before="0" w:after="64" w:line="269" w:lineRule="auto"/>
         <w:ind w:left="255" w:hanging="159"/>
       </w:pPr>
       <w:r>
         <w:rPr>
           <w:b/>
           <w:color w:val="0F9D6A"/>
-          <w:sz w:val="18"/>
+          <w:sz w:val="19"/>
         </w:rPr>
         <w:t xml:space="preserve">• </w:t>
       </w:r>
       <w:r>
         <w:rPr>
           <w:color w:val="111111"/>
-          <w:sz w:val="18"/>
+          <w:sz w:val="19"/>
         </w:rPr>
         <w:t>Owned QA for Android and iOS apps used by 100k+ students; defined test strategy, test plans, and defect workflows.</w:t>
       </w:r>
     </w:p>
     <w:p>
       <w:pPr>
-        <w:spacing w:before="0" w:after="44" w:line="247" w:lineRule="auto"/>
+        <w:spacing w:before="0" w:after="64" w:line="269" w:lineRule="auto"/>
         <w:ind w:left="255" w:hanging="159"/>
       </w:pPr>
       <w:r>
         <w:rPr>
           <w:b/>
           <w:color w:val="0F9D6A"/>
-          <w:sz w:val="18"/>
+          <w:sz w:val="19"/>
         </w:rPr>
         <w:t xml:space="preserve">• </w:t>
       </w:r>
       <w:r>
         <w:rPr>
           <w:color w:val="111111"/>
-          <w:sz w:val="18"/>
+          <w:sz w:val="19"/>
         </w:rPr>
         <w:t>Built the Appium mobile automation test suite from scratch, cutting manual regression effort by 40%.</w:t>
       </w:r>
     </w:p>
     <w:p>
       <w:pPr>
-        <w:spacing w:before="0" w:after="44" w:line="247" w:lineRule="auto"/>
+        <w:spacing w:before="0" w:after="64" w:line="269" w:lineRule="auto"/>
         <w:ind w:left="255" w:hanging="159"/>
       </w:pPr>
       <w:r>
         <w:rPr>
           <w:b/>
           <w:color w:val="0F9D6A"/>
-          <w:sz w:val="18"/>
+          <w:sz w:val="19"/>
         </w:rPr>
         <w:t xml:space="preserve">• </w:t>
       </w:r>
       <w:r>
         <w:rPr>
           <w:color w:val="111111"/>
-          <w:sz w:val="18"/>
+          <w:sz w:val="19"/>
         </w:rPr>
         <w:t>Collaborated with developers and product teams to improve testability and release quality.</w:t>
       </w:r>
@@ -762,13 +770,13 @@
         <w:tabs>
           <w:tab w:pos="10652" w:val="decimal"/>
         </w:tabs>
-        <w:spacing w:before="180" w:after="0"/>
+        <w:spacing w:before="260" w:after="0"/>
       </w:pPr>
       <w:r>
         <w:rPr>
           <w:b/>
           <w:color w:val="111111"/>
-          <w:sz w:val="19"/>
+          <w:sz w:val="21"/>
         </w:rPr>
         <w:t>Associate System Engineer  ·  TPS Worldwide, Karachi</w:t>
       </w:r>
@@ -779,56 +787,56 @@
         <w:rPr>
           <w:i/>
           <w:color w:val="444444"/>
-          <w:sz w:val="17"/>
+          <w:sz w:val="18"/>
         </w:rPr>
         <w:t>Feb 2017 – Oct 2018</w:t>
       </w:r>
     </w:p>
     <w:p>
       <w:pPr>
-        <w:spacing w:before="0" w:after="44" w:line="247" w:lineRule="auto"/>
+        <w:spacing w:before="0" w:after="64" w:line="269" w:lineRule="auto"/>
         <w:ind w:left="255" w:hanging="159"/>
       </w:pPr>
       <w:r>
         <w:rPr>
           <w:b/>
           <w:color w:val="0F9D6A"/>
-          <w:sz w:val="18"/>
+          <w:sz w:val="19"/>
         </w:rPr>
         <w:t xml:space="preserve">• </w:t>
       </w:r>
       <w:r>
         <w:rPr>
           <w:color w:val="111111"/>
-          <w:sz w:val="18"/>
+          <w:sz w:val="19"/>
         </w:rPr>
         <w:t>Supported banks on e-banking and payment-processing incidents, traced transactions across ATM, POS, and internet-banking channels to root cause.</w:t>
       </w:r>
     </w:p>
     <w:p>
       <w:pPr>
-        <w:spacing w:before="0" w:after="44" w:line="247" w:lineRule="auto"/>
+        <w:spacing w:before="0" w:after="64" w:line="269" w:lineRule="auto"/>
         <w:ind w:left="255" w:hanging="159"/>
       </w:pPr>
       <w:r>
         <w:rPr>
           <w:b/>
           <w:color w:val="0F9D6A"/>
-          <w:sz w:val="18"/>
+          <w:sz w:val="19"/>
         </w:rPr>
         <w:t xml:space="preserve">• </w:t>
       </w:r>
       <w:r>
         <w:rPr>
           <w:color w:val="111111"/>
-          <w:sz w:val="18"/>
+          <w:sz w:val="19"/>
         </w:rPr>
         <w:t>Queried MySQL and Oracle 10g/11g databases using SQL to investigate production incidents.</w:t>
       </w:r>
     </w:p>
     <w:p>
       <w:pPr>
-        <w:spacing w:before="240" w:after="80"/>
+        <w:spacing w:before="320" w:after="100"/>
         <w:pBdr>
           <w:bottom w:val="single" w:sz="4" w:space="1" w:color="0F9D6A"/>
         </w:pBdr>
@@ -838,7 +846,7 @@
           <w:rFonts w:ascii="Calibri" w:hAnsi="Calibri"/>
           <w:b/>
           <w:color w:val="0F9D6A"/>
-          <w:sz w:val="24"/>
+          <w:sz w:val="26"/>
         </w:rPr>
         <w:t>AI-ASSISTED TESTING PROJECTS (GITHUB)</w:t>
       </w:r>
@@ -851,14 +859,14 @@
         <w:rPr>
           <w:b/>
           <w:color w:val="111111"/>
-          <w:sz w:val="19"/>
+          <w:sz w:val="21"/>
         </w:rPr>
         <w:t>AI QA Automation Framework — LLM &amp; RAG Quality Evaluation</w:t>
       </w:r>
     </w:p>
     <w:p>
       <w:pPr>
-        <w:spacing w:after="30"/>
+        <w:spacing w:after="40"/>
       </w:pPr>
       <w:r>
         <w:rPr>
@@ -871,42 +879,42 @@
     </w:p>
     <w:p>
       <w:pPr>
-        <w:spacing w:before="0" w:after="44" w:line="247" w:lineRule="auto"/>
+        <w:spacing w:before="0" w:after="64" w:line="269" w:lineRule="auto"/>
         <w:ind w:left="255" w:hanging="159"/>
       </w:pPr>
       <w:r>
         <w:rPr>
           <w:b/>
           <w:color w:val="0F9D6A"/>
-          <w:sz w:val="18"/>
+          <w:sz w:val="19"/>
         </w:rPr>
         <w:t xml:space="preserve">• </w:t>
       </w:r>
       <w:r>
         <w:rPr>
           <w:color w:val="111111"/>
-          <w:sz w:val="18"/>
+          <w:sz w:val="19"/>
         </w:rPr>
         <w:t>Built a Playwright + Pytest framework that tests an LLM customer-support assistant through the browser, then layers AI evaluation (DeepEval, RAGAS, Promptfoo) on top to score response relevancy, faithfulness, and retrieval quality.</w:t>
       </w:r>
     </w:p>
     <w:p>
       <w:pPr>
-        <w:spacing w:before="0" w:after="44" w:line="247" w:lineRule="auto"/>
+        <w:spacing w:before="0" w:after="64" w:line="269" w:lineRule="auto"/>
         <w:ind w:left="255" w:hanging="159"/>
       </w:pPr>
       <w:r>
         <w:rPr>
           <w:b/>
           <w:color w:val="0F9D6A"/>
-          <w:sz w:val="18"/>
+          <w:sz w:val="19"/>
         </w:rPr>
         <w:t xml:space="preserve">• </w:t>
       </w:r>
       <w:r>
         <w:rPr>
           <w:color w:val="111111"/>
-          <w:sz w:val="18"/>
+          <w:sz w:val="19"/>
         </w:rPr>
         <w:t>Wired a CI/CD quality gate into GitHub Actions that blocks a merge when evaluation scores drop below threshold.</w:t>
       </w:r>
@@ -919,14 +927,14 @@
         <w:rPr>
           <w:b/>
           <w:color w:val="111111"/>
-          <w:sz w:val="19"/>
+          <w:sz w:val="21"/>
         </w:rPr>
         <w:t>Playwright Test Agent — Web &amp; API Suite with Staged CI</w:t>
       </w:r>
     </w:p>
     <w:p>
       <w:pPr>
-        <w:spacing w:after="30"/>
+        <w:spacing w:after="40"/>
       </w:pPr>
       <w:r>
         <w:rPr>
@@ -939,42 +947,42 @@
     </w:p>
     <w:p>
       <w:pPr>
-        <w:spacing w:before="0" w:after="44" w:line="247" w:lineRule="auto"/>
+        <w:spacing w:before="0" w:after="64" w:line="269" w:lineRule="auto"/>
         <w:ind w:left="255" w:hanging="159"/>
       </w:pPr>
       <w:r>
         <w:rPr>
           <w:b/>
           <w:color w:val="0F9D6A"/>
-          <w:sz w:val="18"/>
+          <w:sz w:val="19"/>
         </w:rPr>
         <w:t xml:space="preserve">• </w:t>
       </w:r>
       <w:r>
         <w:rPr>
           <w:color w:val="111111"/>
-          <w:sz w:val="18"/>
+          <w:sz w:val="19"/>
         </w:rPr>
         <w:t>Built an AI-assisted test automation workflow combining LLM-based scenario classification with executable Playwright web and API tests.</w:t>
       </w:r>
     </w:p>
     <w:p>
       <w:pPr>
-        <w:spacing w:before="0" w:after="44" w:line="247" w:lineRule="auto"/>
+        <w:spacing w:before="0" w:after="64" w:line="269" w:lineRule="auto"/>
         <w:ind w:left="255" w:hanging="159"/>
       </w:pPr>
       <w:r>
         <w:rPr>
           <w:b/>
           <w:color w:val="0F9D6A"/>
-          <w:sz w:val="18"/>
+          <w:sz w:val="19"/>
         </w:rPr>
         <w:t xml:space="preserve">• </w:t>
       </w:r>
       <w:r>
         <w:rPr>
           <w:color w:val="111111"/>
-          <w:sz w:val="18"/>
+          <w:sz w:val="19"/>
         </w:rPr>
         <w:t>Designed a staged GitHub Actions pipeline: API → UI smoke → UI full → cross-browser matrix.</w:t>
       </w:r>
@@ -987,14 +995,14 @@
         <w:rPr>
           <w:b/>
           <w:color w:val="111111"/>
-          <w:sz w:val="19"/>
+          <w:sz w:val="21"/>
         </w:rPr>
         <w:t>Playwright Agents — Autonomous E2E Testing</w:t>
       </w:r>
     </w:p>
     <w:p>
       <w:pPr>
-        <w:spacing w:after="30"/>
+        <w:spacing w:after="40"/>
       </w:pPr>
       <w:r>
         <w:rPr>
@@ -1007,28 +1015,28 @@
     </w:p>
     <w:p>
       <w:pPr>
-        <w:spacing w:before="0" w:after="44" w:line="247" w:lineRule="auto"/>
+        <w:spacing w:before="0" w:after="64" w:line="269" w:lineRule="auto"/>
         <w:ind w:left="255" w:hanging="159"/>
       </w:pPr>
       <w:r>
         <w:rPr>
           <w:b/>
           <w:color w:val="0F9D6A"/>
-          <w:sz w:val="18"/>
+          <w:sz w:val="19"/>
         </w:rPr>
         <w:t xml:space="preserve">• </w:t>
       </w:r>
       <w:r>
         <w:rPr>
           <w:color w:val="111111"/>
-          <w:sz w:val="18"/>
+          <w:sz w:val="19"/>
         </w:rPr>
         <w:t>Planner/generator/healer agent workflow: agents explore the app, generate executable E2E tests from a Markdown plan, and repair failing tests on a POM fixture architecture.</w:t>
       </w:r>
     </w:p>
     <w:p>
       <w:pPr>
-        <w:spacing w:before="240" w:after="80"/>
+        <w:spacing w:before="320" w:after="100"/>
         <w:pBdr>
           <w:bottom w:val="single" w:sz="4" w:space="1" w:color="0F9D6A"/>
         </w:pBdr>
@@ -1038,14 +1046,14 @@
           <w:rFonts w:ascii="Calibri" w:hAnsi="Calibri"/>
           <w:b/>
           <w:color w:val="0F9D6A"/>
-          <w:sz w:val="24"/>
+          <w:sz w:val="26"/>
         </w:rPr>
         <w:t>EDUCATION</w:t>
       </w:r>
     </w:p>
     <w:p>
       <w:pPr>
-        <w:spacing w:before="0" w:after="0" w:line="252" w:lineRule="auto"/>
+        <w:spacing w:before="0" w:after="20" w:line="252" w:lineRule="auto"/>
       </w:pPr>
       <w:r>
         <w:rPr>
@@ -1053,14 +1061,14 @@
           <w:b/>
           <w:i w:val="0"/>
           <w:color w:val="111111"/>
-          <w:sz w:val="18"/>
+          <w:sz w:val="19"/>
         </w:rPr>
         <w:t>M.Sc. coursework, Applied Mathematics — Network &amp; Data Sciences</w:t>
       </w:r>
     </w:p>
     <w:p>
       <w:pPr>
-        <w:spacing w:before="0" w:after="80" w:line="252" w:lineRule="auto"/>
+        <w:spacing w:before="0" w:after="120" w:line="252" w:lineRule="auto"/>
       </w:pPr>
       <w:r>
         <w:rPr>
@@ -1068,14 +1076,14 @@
           <w:b w:val="0"/>
           <w:i w:val="0"/>
           <w:color w:val="444444"/>
-          <w:sz w:val="17"/>
+          <w:sz w:val="18"/>
         </w:rPr>
         <w:t>Hochschule Mittweida, Germany (90 ECTS completed) · 2018–2024</w:t>
       </w:r>
     </w:p>
     <w:p>
       <w:pPr>
-        <w:spacing w:before="0" w:after="0" w:line="252" w:lineRule="auto"/>
+        <w:spacing w:before="0" w:after="20" w:line="252" w:lineRule="auto"/>
       </w:pPr>
       <w:r>
         <w:rPr>
@@ -1083,14 +1091,14 @@
           <w:b/>
           <w:i w:val="0"/>
           <w:color w:val="111111"/>
-          <w:sz w:val="18"/>
+          <w:sz w:val="19"/>
         </w:rPr>
         <w:t>B.Sc. Computer Science</w:t>
       </w:r>
     </w:p>
     <w:p>
       <w:pPr>
-        <w:spacing w:before="0" w:after="40" w:line="252" w:lineRule="auto"/>
+        <w:spacing w:before="0" w:after="60" w:line="252" w:lineRule="auto"/>
       </w:pPr>
       <w:r>
         <w:rPr>
@@ -1098,14 +1106,14 @@
           <w:b w:val="0"/>
           <w:i w:val="0"/>
           <w:color w:val="444444"/>
-          <w:sz w:val="17"/>
+          <w:sz w:val="18"/>
         </w:rPr>
         <w:t>Sir Syed University of Engineering &amp; Technology, Karachi, Pakistan · 2012–2016</w:t>
       </w:r>
     </w:p>
     <w:p>
       <w:pPr>
-        <w:spacing w:before="240" w:after="80"/>
+        <w:spacing w:before="320" w:after="100"/>
         <w:pBdr>
           <w:bottom w:val="single" w:sz="4" w:space="1" w:color="0F9D6A"/>
         </w:pBdr>
@@ -1115,77 +1123,77 @@
           <w:rFonts w:ascii="Calibri" w:hAnsi="Calibri"/>
           <w:b/>
           <w:color w:val="0F9D6A"/>
-          <w:sz w:val="24"/>
+          <w:sz w:val="26"/>
         </w:rPr>
         <w:t>CERTIFICATIONS &amp; TRAINING</w:t>
       </w:r>
     </w:p>
     <w:p>
       <w:pPr>
-        <w:spacing w:before="0" w:after="44" w:line="247" w:lineRule="auto"/>
+        <w:spacing w:before="0" w:after="64" w:line="269" w:lineRule="auto"/>
         <w:ind w:left="255" w:hanging="159"/>
       </w:pPr>
       <w:r>
         <w:rPr>
           <w:b/>
           <w:color w:val="0F9D6A"/>
-          <w:sz w:val="18"/>
+          <w:sz w:val="19"/>
         </w:rPr>
         <w:t xml:space="preserve">• </w:t>
       </w:r>
       <w:r>
         <w:rPr>
           <w:color w:val="111111"/>
-          <w:sz w:val="18"/>
+          <w:sz w:val="19"/>
         </w:rPr>
         <w:t>DevOps on AWS: Tools for Automated Workflows (LinkedIn Learning)</w:t>
       </w:r>
     </w:p>
     <w:p>
       <w:pPr>
-        <w:spacing w:before="0" w:after="44" w:line="247" w:lineRule="auto"/>
+        <w:spacing w:before="0" w:after="64" w:line="269" w:lineRule="auto"/>
         <w:ind w:left="255" w:hanging="159"/>
       </w:pPr>
       <w:r>
         <w:rPr>
           <w:b/>
           <w:color w:val="0F9D6A"/>
-          <w:sz w:val="18"/>
+          <w:sz w:val="19"/>
         </w:rPr>
         <w:t xml:space="preserve">• </w:t>
       </w:r>
       <w:r>
         <w:rPr>
           <w:color w:val="111111"/>
-          <w:sz w:val="18"/>
+          <w:sz w:val="19"/>
         </w:rPr>
         <w:t>Intermediate Jenkins: Automate, Integrate, and Secure CI/CD Workflows at Scale (LinkedIn Learning)</w:t>
       </w:r>
     </w:p>
     <w:p>
       <w:pPr>
-        <w:spacing w:before="0" w:after="44" w:line="247" w:lineRule="auto"/>
+        <w:spacing w:before="0" w:after="64" w:line="269" w:lineRule="auto"/>
         <w:ind w:left="255" w:hanging="159"/>
       </w:pPr>
       <w:r>
         <w:rPr>
           <w:b/>
           <w:color w:val="0F9D6A"/>
-          <w:sz w:val="18"/>
+          <w:sz w:val="19"/>
         </w:rPr>
         <w:t xml:space="preserve">• </w:t>
       </w:r>
       <w:r>
         <w:rPr>
           <w:color w:val="111111"/>
-          <w:sz w:val="18"/>
+          <w:sz w:val="19"/>
         </w:rPr>
         <w:t>Playwright Advanced Automation (Udemy)</w:t>
       </w:r>
     </w:p>
     <w:p>
       <w:pPr>
-        <w:spacing w:before="240" w:after="80"/>
+        <w:spacing w:before="320" w:after="100"/>
         <w:pBdr>
           <w:bottom w:val="single" w:sz="4" w:space="1" w:color="0F9D6A"/>
         </w:pBdr>
@@ -1195,7 +1203,7 @@
           <w:rFonts w:ascii="Calibri" w:hAnsi="Calibri"/>
           <w:b/>
           <w:color w:val="0F9D6A"/>
-          <w:sz w:val="24"/>
+          <w:sz w:val="26"/>
         </w:rPr>
         <w:t>LANGUAGES</w:t>
       </w:r>
@@ -1210,7 +1218,7 @@
           <w:b w:val="0"/>
           <w:i w:val="0"/>
           <w:color w:val="111111"/>
-          <w:sz w:val="18"/>
+          <w:sz w:val="19"/>
         </w:rPr>
         <w:t>English: Fluent (full working proficiency)      German: A2 (actively pursuing B1)</w:t>
       </w:r>
@@ -1589,11 +1597,11 @@
     <w:qFormat/>
     <w:rsid w:val="00FC693F"/>
     <w:pPr>
-      <w:spacing w:after="0" w:before="0" w:line="252" w:lineRule="auto"/>
+      <w:spacing w:after="0" w:before="0" w:line="269" w:lineRule="auto"/>
     </w:pPr>
     <w:rPr>
       <w:rFonts w:ascii="Calibri" w:hAnsi="Calibri"/>
-      <w:sz w:val="19"/>
+      <w:sz w:val="20"/>
     </w:rPr>
   </w:style>
   <w:style w:type="paragraph" w:styleId="Header">

</xml_diff>